<commit_message>
feat(relevance): fix relevance gagal klasifikasi, dan perbaikan UI
</commit_message>
<xml_diff>
--- a/Guidebook Pengguna KABARE.docx
+++ b/Guidebook Pengguna KABARE.docx
@@ -1674,6 +1674,45 @@
     </w:p>
     <w:p>
       <w:pPr>
+        <w:jc w:val="center"/>
+      </w:pPr>
+      <w:r>
+        <w:drawing>
+          <wp:inline xmlns:a="http://schemas.openxmlformats.org/drawingml/2006/main" xmlns:pic="http://schemas.openxmlformats.org/drawingml/2006/picture">
+            <wp:extent cx="5486400" cy="3429000"/>
+            <wp:docPr id="2" name="Picture 2"/>
+            <wp:cNvGraphicFramePr>
+              <a:graphicFrameLocks noChangeAspect="1"/>
+            </wp:cNvGraphicFramePr>
+            <a:graphic>
+              <a:graphicData uri="http://schemas.openxmlformats.org/drawingml/2006/picture">
+                <pic:pic>
+                  <pic:nvPicPr>
+                    <pic:cNvPr id="0" name="02_dashboard_overview.png"/>
+                    <pic:cNvPicPr/>
+                  </pic:nvPicPr>
+                  <pic:blipFill>
+                    <a:blip r:embed="rId11"/>
+                    <a:stretch>
+                      <a:fillRect/>
+                    </a:stretch>
+                  </pic:blipFill>
+                  <pic:spPr>
+                    <a:xfrm>
+                      <a:off x="0" y="0"/>
+                      <a:ext cx="5486400" cy="3429000"/>
+                    </a:xfrm>
+                    <a:prstGeom prst="rect"/>
+                  </pic:spPr>
+                </pic:pic>
+              </a:graphicData>
+            </a:graphic>
+          </wp:inline>
+        </w:drawing>
+      </w:r>
+    </w:p>
+    <w:p>
+      <w:pPr>
         <w:pStyle w:val="ListParagraph"/>
         <w:numPr>
           <w:ilvl w:val="0"/>
@@ -1779,6 +1818,45 @@
     </w:p>
     <w:p>
       <w:pPr>
+        <w:jc w:val="center"/>
+      </w:pPr>
+      <w:r>
+        <w:drawing>
+          <wp:inline xmlns:a="http://schemas.openxmlformats.org/drawingml/2006/main" xmlns:pic="http://schemas.openxmlformats.org/drawingml/2006/picture">
+            <wp:extent cx="5486400" cy="3429000"/>
+            <wp:docPr id="3" name="Picture 3"/>
+            <wp:cNvGraphicFramePr>
+              <a:graphicFrameLocks noChangeAspect="1"/>
+            </wp:cNvGraphicFramePr>
+            <a:graphic>
+              <a:graphicData uri="http://schemas.openxmlformats.org/drawingml/2006/picture">
+                <pic:pic>
+                  <pic:nvPicPr>
+                    <pic:cNvPr id="0" name="01_login.png"/>
+                    <pic:cNvPicPr/>
+                  </pic:nvPicPr>
+                  <pic:blipFill>
+                    <a:blip r:embed="rId12"/>
+                    <a:stretch>
+                      <a:fillRect/>
+                    </a:stretch>
+                  </pic:blipFill>
+                  <pic:spPr>
+                    <a:xfrm>
+                      <a:off x="0" y="0"/>
+                      <a:ext cx="5486400" cy="3429000"/>
+                    </a:xfrm>
+                    <a:prstGeom prst="rect"/>
+                  </pic:spPr>
+                </pic:pic>
+              </a:graphicData>
+            </a:graphic>
+          </wp:inline>
+        </w:drawing>
+      </w:r>
+    </w:p>
+    <w:p>
+      <w:pPr>
         <w:pStyle w:val="Heading2"/>
         <w:spacing w:after="140" w:line="360" w:lineRule="auto"/>
         <w:jc w:val="both"/>
@@ -1879,6 +1957,45 @@
     </w:p>
     <w:p>
       <w:pPr>
+        <w:jc w:val="center"/>
+      </w:pPr>
+      <w:r>
+        <w:drawing>
+          <wp:inline xmlns:a="http://schemas.openxmlformats.org/drawingml/2006/main" xmlns:pic="http://schemas.openxmlformats.org/drawingml/2006/picture">
+            <wp:extent cx="5486400" cy="3429000"/>
+            <wp:docPr id="4" name="Picture 4"/>
+            <wp:cNvGraphicFramePr>
+              <a:graphicFrameLocks noChangeAspect="1"/>
+            </wp:cNvGraphicFramePr>
+            <a:graphic>
+              <a:graphicData uri="http://schemas.openxmlformats.org/drawingml/2006/picture">
+                <pic:pic>
+                  <pic:nvPicPr>
+                    <pic:cNvPr id="0" name="03_data_berita.png"/>
+                    <pic:cNvPicPr/>
+                  </pic:nvPicPr>
+                  <pic:blipFill>
+                    <a:blip r:embed="rId13"/>
+                    <a:stretch>
+                      <a:fillRect/>
+                    </a:stretch>
+                  </pic:blipFill>
+                  <pic:spPr>
+                    <a:xfrm>
+                      <a:off x="0" y="0"/>
+                      <a:ext cx="5486400" cy="3429000"/>
+                    </a:xfrm>
+                    <a:prstGeom prst="rect"/>
+                  </pic:spPr>
+                </pic:pic>
+              </a:graphicData>
+            </a:graphic>
+          </wp:inline>
+        </w:drawing>
+      </w:r>
+    </w:p>
+    <w:p>
+      <w:pPr>
         <w:pStyle w:val="Heading2"/>
         <w:spacing w:after="140" w:line="360" w:lineRule="auto"/>
         <w:jc w:val="both"/>
@@ -2040,6 +2157,45 @@
     </w:p>
     <w:p>
       <w:pPr>
+        <w:jc w:val="center"/>
+      </w:pPr>
+      <w:r>
+        <w:drawing>
+          <wp:inline xmlns:a="http://schemas.openxmlformats.org/drawingml/2006/main" xmlns:pic="http://schemas.openxmlformats.org/drawingml/2006/picture">
+            <wp:extent cx="5486400" cy="3429000"/>
+            <wp:docPr id="5" name="Picture 5"/>
+            <wp:cNvGraphicFramePr>
+              <a:graphicFrameLocks noChangeAspect="1"/>
+            </wp:cNvGraphicFramePr>
+            <a:graphic>
+              <a:graphicData uri="http://schemas.openxmlformats.org/drawingml/2006/picture">
+                <pic:pic>
+                  <pic:nvPicPr>
+                    <pic:cNvPr id="0" name="04_detail_berita.png"/>
+                    <pic:cNvPicPr/>
+                  </pic:nvPicPr>
+                  <pic:blipFill>
+                    <a:blip r:embed="rId14"/>
+                    <a:stretch>
+                      <a:fillRect/>
+                    </a:stretch>
+                  </pic:blipFill>
+                  <pic:spPr>
+                    <a:xfrm>
+                      <a:off x="0" y="0"/>
+                      <a:ext cx="5486400" cy="3429000"/>
+                    </a:xfrm>
+                    <a:prstGeom prst="rect"/>
+                  </pic:spPr>
+                </pic:pic>
+              </a:graphicData>
+            </a:graphic>
+          </wp:inline>
+        </w:drawing>
+      </w:r>
+    </w:p>
+    <w:p>
+      <w:pPr>
         <w:pStyle w:val="ListParagraph"/>
         <w:numPr>
           <w:ilvl w:val="0"/>
@@ -2197,6 +2353,45 @@
     </w:p>
     <w:p>
       <w:pPr>
+        <w:jc w:val="center"/>
+      </w:pPr>
+      <w:r>
+        <w:drawing>
+          <wp:inline xmlns:a="http://schemas.openxmlformats.org/drawingml/2006/main" xmlns:pic="http://schemas.openxmlformats.org/drawingml/2006/picture">
+            <wp:extent cx="5486400" cy="3429000"/>
+            <wp:docPr id="6" name="Picture 6"/>
+            <wp:cNvGraphicFramePr>
+              <a:graphicFrameLocks noChangeAspect="1"/>
+            </wp:cNvGraphicFramePr>
+            <a:graphic>
+              <a:graphicData uri="http://schemas.openxmlformats.org/drawingml/2006/picture">
+                <pic:pic>
+                  <pic:nvPicPr>
+                    <pic:cNvPr id="0" name="04_detail_berita.png"/>
+                    <pic:cNvPicPr/>
+                  </pic:nvPicPr>
+                  <pic:blipFill>
+                    <a:blip r:embed="rId14"/>
+                    <a:stretch>
+                      <a:fillRect/>
+                    </a:stretch>
+                  </pic:blipFill>
+                  <pic:spPr>
+                    <a:xfrm>
+                      <a:off x="0" y="0"/>
+                      <a:ext cx="5486400" cy="3429000"/>
+                    </a:xfrm>
+                    <a:prstGeom prst="rect"/>
+                  </pic:spPr>
+                </pic:pic>
+              </a:graphicData>
+            </a:graphic>
+          </wp:inline>
+        </w:drawing>
+      </w:r>
+    </w:p>
+    <w:p>
+      <w:pPr>
         <w:pStyle w:val="Heading2"/>
         <w:spacing w:after="140" w:line="360" w:lineRule="auto"/>
         <w:jc w:val="both"/>
@@ -2413,6 +2608,45 @@
     </w:p>
     <w:p>
       <w:pPr>
+        <w:jc w:val="center"/>
+      </w:pPr>
+      <w:r>
+        <w:drawing>
+          <wp:inline xmlns:a="http://schemas.openxmlformats.org/drawingml/2006/main" xmlns:pic="http://schemas.openxmlformats.org/drawingml/2006/picture">
+            <wp:extent cx="5486400" cy="3429000"/>
+            <wp:docPr id="7" name="Picture 7"/>
+            <wp:cNvGraphicFramePr>
+              <a:graphicFrameLocks noChangeAspect="1"/>
+            </wp:cNvGraphicFramePr>
+            <a:graphic>
+              <a:graphicData uri="http://schemas.openxmlformats.org/drawingml/2006/picture">
+                <pic:pic>
+                  <pic:nvPicPr>
+                    <pic:cNvPr id="0" name="05_official_statistics.png"/>
+                    <pic:cNvPicPr/>
+                  </pic:nvPicPr>
+                  <pic:blipFill>
+                    <a:blip r:embed="rId15"/>
+                    <a:stretch>
+                      <a:fillRect/>
+                    </a:stretch>
+                  </pic:blipFill>
+                  <pic:spPr>
+                    <a:xfrm>
+                      <a:off x="0" y="0"/>
+                      <a:ext cx="5486400" cy="3429000"/>
+                    </a:xfrm>
+                    <a:prstGeom prst="rect"/>
+                  </pic:spPr>
+                </pic:pic>
+              </a:graphicData>
+            </a:graphic>
+          </wp:inline>
+        </w:drawing>
+      </w:r>
+    </w:p>
+    <w:p>
+      <w:pPr>
         <w:pStyle w:val="ListParagraph"/>
         <w:numPr>
           <w:ilvl w:val="0"/>
@@ -2502,6 +2736,45 @@
     </w:p>
     <w:p>
       <w:pPr>
+        <w:jc w:val="center"/>
+      </w:pPr>
+      <w:r>
+        <w:drawing>
+          <wp:inline xmlns:a="http://schemas.openxmlformats.org/drawingml/2006/main" xmlns:pic="http://schemas.openxmlformats.org/drawingml/2006/picture">
+            <wp:extent cx="5486400" cy="3429000"/>
+            <wp:docPr id="8" name="Picture 8"/>
+            <wp:cNvGraphicFramePr>
+              <a:graphicFrameLocks noChangeAspect="1"/>
+            </wp:cNvGraphicFramePr>
+            <a:graphic>
+              <a:graphicData uri="http://schemas.openxmlformats.org/drawingml/2006/picture">
+                <pic:pic>
+                  <pic:nvPicPr>
+                    <pic:cNvPr id="0" name="06_insight_ai.png"/>
+                    <pic:cNvPicPr/>
+                  </pic:nvPicPr>
+                  <pic:blipFill>
+                    <a:blip r:embed="rId16"/>
+                    <a:stretch>
+                      <a:fillRect/>
+                    </a:stretch>
+                  </pic:blipFill>
+                  <pic:spPr>
+                    <a:xfrm>
+                      <a:off x="0" y="0"/>
+                      <a:ext cx="5486400" cy="3429000"/>
+                    </a:xfrm>
+                    <a:prstGeom prst="rect"/>
+                  </pic:spPr>
+                </pic:pic>
+              </a:graphicData>
+            </a:graphic>
+          </wp:inline>
+        </w:drawing>
+      </w:r>
+    </w:p>
+    <w:p>
+      <w:pPr>
         <w:pStyle w:val="Heading2"/>
         <w:spacing w:after="140" w:line="360" w:lineRule="auto"/>
         <w:jc w:val="both"/>
@@ -2690,6 +2963,45 @@
           <w:color w:val="1F2937"/>
         </w:rPr>
         <w:t>AI Chat disiapkan untuk membantu tanya jawab yang lebih fleksibel. Jika Insight AI memberi ringkasan yang sifatnya lebih terstruktur, AI Chat membantu ketika Anda ingin menggali pertanyaan secara bertahap, membandingkan informasi, atau meminta penjelasan dengan bahasa yang lebih langsung.</w:t>
+      </w:r>
+    </w:p>
+    <w:p>
+      <w:pPr>
+        <w:jc w:val="center"/>
+      </w:pPr>
+      <w:r>
+        <w:drawing>
+          <wp:inline xmlns:a="http://schemas.openxmlformats.org/drawingml/2006/main" xmlns:pic="http://schemas.openxmlformats.org/drawingml/2006/picture">
+            <wp:extent cx="5486400" cy="3429000"/>
+            <wp:docPr id="9" name="Picture 9"/>
+            <wp:cNvGraphicFramePr>
+              <a:graphicFrameLocks noChangeAspect="1"/>
+            </wp:cNvGraphicFramePr>
+            <a:graphic>
+              <a:graphicData uri="http://schemas.openxmlformats.org/drawingml/2006/picture">
+                <pic:pic>
+                  <pic:nvPicPr>
+                    <pic:cNvPr id="0" name="07_ai_chat.png"/>
+                    <pic:cNvPicPr/>
+                  </pic:nvPicPr>
+                  <pic:blipFill>
+                    <a:blip r:embed="rId17"/>
+                    <a:stretch>
+                      <a:fillRect/>
+                    </a:stretch>
+                  </pic:blipFill>
+                  <pic:spPr>
+                    <a:xfrm>
+                      <a:off x="0" y="0"/>
+                      <a:ext cx="5486400" cy="3429000"/>
+                    </a:xfrm>
+                    <a:prstGeom prst="rect"/>
+                  </pic:spPr>
+                </pic:pic>
+              </a:graphicData>
+            </a:graphic>
+          </wp:inline>
+        </w:drawing>
       </w:r>
     </w:p>
     <w:p>

</xml_diff>